<commit_message>
Migrate website to Jekyll source
</commit_message>
<xml_diff>
--- a/the web site HOW TO.docx
+++ b/the web site HOW TO.docx
@@ -1,6 +1,6 @@
 
 <file path=word/document.xml><?xml version="1.0" encoding="utf-8"?>
-<w:document xmlns:wpc="http://schemas.microsoft.com/office/word/2010/wordprocessingCanvas" xmlns:cx="http://schemas.microsoft.com/office/drawing/2014/chartex" xmlns:cx1="http://schemas.microsoft.com/office/drawing/2015/9/8/chartex" xmlns:cx2="http://schemas.microsoft.com/office/drawing/2015/10/21/chartex" xmlns:cx3="http://schemas.microsoft.com/office/drawing/2016/5/9/chartex" xmlns:cx4="http://schemas.microsoft.com/office/drawing/2016/5/10/chartex" xmlns:cx5="http://schemas.microsoft.com/office/drawing/2016/5/11/chartex" xmlns:cx6="http://schemas.microsoft.com/office/drawing/2016/5/12/chartex" xmlns:cx7="http://schemas.microsoft.com/office/drawing/2016/5/13/chartex" xmlns:cx8="http://schemas.microsoft.com/office/drawing/2016/5/14/chartex" xmlns:mc="http://schemas.openxmlformats.org/markup-compatibility/2006" xmlns:aink="http://schemas.microsoft.com/office/drawing/2016/ink" xmlns:am3d="http://schemas.microsoft.com/office/drawing/2017/model3d" xmlns:o="urn:schemas-microsoft-com:office:office" xmlns:oel="http://schemas.microsoft.com/office/2019/extlst" xmlns:r="http://schemas.openxmlformats.org/officeDocument/2006/relationships" xmlns:m="http://schemas.openxmlformats.org/officeDocument/2006/math" xmlns:v="urn:schemas-microsoft-com:vml" xmlns:wp14="http://schemas.microsoft.com/office/word/2010/wordprocessingDrawing" xmlns:wp="http://schemas.openxmlformats.org/drawingml/2006/wordprocessingDrawing" xmlns:w10="urn:schemas-microsoft-com:office:word" xmlns:w="http://schemas.openxmlformats.org/wordprocessingml/2006/main" xmlns:w14="http://schemas.microsoft.com/office/word/2010/wordml" xmlns:w15="http://schemas.microsoft.com/office/word/2012/wordml" xmlns:w16cex="http://schemas.microsoft.com/office/word/2018/wordml/cex" xmlns:w16cid="http://schemas.microsoft.com/office/word/2016/wordml/cid" xmlns:w16="http://schemas.microsoft.com/office/word/2018/wordml" xmlns:w16sdtdh="http://schemas.microsoft.com/office/word/2020/wordml/sdtdatahash" xmlns:w16se="http://schemas.microsoft.com/office/word/2015/wordml/symex" xmlns:wpg="http://schemas.microsoft.com/office/word/2010/wordprocessingGroup" xmlns:wpi="http://schemas.microsoft.com/office/word/2010/wordprocessingInk" xmlns:wne="http://schemas.microsoft.com/office/word/2006/wordml" xmlns:wps="http://schemas.microsoft.com/office/word/2010/wordprocessingShape" mc:Ignorable="w14 w15 w16se w16cid w16 w16cex w16sdtdh wp14">
+<w:document xmlns:wpc="http://schemas.microsoft.com/office/word/2010/wordprocessingCanvas" xmlns:cx="http://schemas.microsoft.com/office/drawing/2014/chartex" xmlns:cx1="http://schemas.microsoft.com/office/drawing/2015/9/8/chartex" xmlns:cx2="http://schemas.microsoft.com/office/drawing/2015/10/21/chartex" xmlns:cx3="http://schemas.microsoft.com/office/drawing/2016/5/9/chartex" xmlns:cx4="http://schemas.microsoft.com/office/drawing/2016/5/10/chartex" xmlns:cx5="http://schemas.microsoft.com/office/drawing/2016/5/11/chartex" xmlns:cx6="http://schemas.microsoft.com/office/drawing/2016/5/12/chartex" xmlns:cx7="http://schemas.microsoft.com/office/drawing/2016/5/13/chartex" xmlns:cx8="http://schemas.microsoft.com/office/drawing/2016/5/14/chartex" xmlns:mc="http://schemas.openxmlformats.org/markup-compatibility/2006" xmlns:aink="http://schemas.microsoft.com/office/drawing/2016/ink" xmlns:am3d="http://schemas.microsoft.com/office/drawing/2017/model3d" xmlns:o="urn:schemas-microsoft-com:office:office" xmlns:oel="http://schemas.microsoft.com/office/2019/extlst" xmlns:r="http://schemas.openxmlformats.org/officeDocument/2006/relationships" xmlns:m="http://schemas.openxmlformats.org/officeDocument/2006/math" xmlns:v="urn:schemas-microsoft-com:vml" xmlns:wp14="http://schemas.microsoft.com/office/word/2010/wordprocessingDrawing" xmlns:wp="http://schemas.openxmlformats.org/drawingml/2006/wordprocessingDrawing" xmlns:w10="urn:schemas-microsoft-com:office:word" xmlns:w="http://schemas.openxmlformats.org/wordprocessingml/2006/main" xmlns:w14="http://schemas.microsoft.com/office/word/2010/wordml" xmlns:w15="http://schemas.microsoft.com/office/word/2012/wordml" xmlns:w16cex="http://schemas.microsoft.com/office/word/2018/wordml/cex" xmlns:w16cid="http://schemas.microsoft.com/office/word/2016/wordml/cid" xmlns:w16="http://schemas.microsoft.com/office/word/2018/wordml" xmlns:w16du="http://schemas.microsoft.com/office/word/2023/wordml/word16du" xmlns:w16sdtdh="http://schemas.microsoft.com/office/word/2020/wordml/sdtdatahash" xmlns:w16sdtfl="http://schemas.microsoft.com/office/word/2024/wordml/sdtformatlock" xmlns:w16se="http://schemas.microsoft.com/office/word/2015/wordml/symex" xmlns:wpg="http://schemas.microsoft.com/office/word/2010/wordprocessingGroup" xmlns:wpi="http://schemas.microsoft.com/office/word/2010/wordprocessingInk" xmlns:wne="http://schemas.microsoft.com/office/word/2006/wordml" xmlns:wps="http://schemas.microsoft.com/office/word/2010/wordprocessingShape" mc:Ignorable="w14 w15 w16se w16cid w16 w16cex w16sdtdh w16sdtfl w16du wp14">
   <w:body>
     <w:p>
       <w:pPr>
@@ -30,7 +30,7 @@
       <w:hyperlink r:id="rId8" w:history="1">
         <w:r>
           <w:rPr>
-            <w:rStyle w:val="a3"/>
+            <w:rStyle w:val="Hyperlink"/>
           </w:rPr>
           <w:t>Jekyll on macOS | Jekyll • Simple, blog-aware, static sites (jekyllrb.com)</w:t>
         </w:r>
@@ -89,8 +89,13 @@
         <w:t>b</w:t>
       </w:r>
       <w:r>
-        <w:t>undler install</w:t>
-      </w:r>
+        <w:t xml:space="preserve">undler </w:t>
+      </w:r>
+      <w:proofErr w:type="gramStart"/>
+      <w:r>
+        <w:t>install</w:t>
+      </w:r>
+      <w:proofErr w:type="gramEnd"/>
     </w:p>
     <w:p>
       <w:r>
@@ -99,7 +104,7 @@
     </w:p>
     <w:p>
       <w:pPr>
-        <w:pStyle w:val="a4"/>
+        <w:pStyle w:val="ListParagraph"/>
         <w:numPr>
           <w:ilvl w:val="0"/>
           <w:numId w:val="1"/>
@@ -112,7 +117,7 @@
     </w:p>
     <w:p>
       <w:pPr>
-        <w:pStyle w:val="a4"/>
+        <w:pStyle w:val="ListParagraph"/>
         <w:numPr>
           <w:ilvl w:val="1"/>
           <w:numId w:val="1"/>
@@ -123,7 +128,15 @@
         <w:t>b</w:t>
       </w:r>
       <w:r>
-        <w:t>undler exec jekyll serve</w:t>
+        <w:t xml:space="preserve">undler exec </w:t>
+      </w:r>
+      <w:proofErr w:type="spellStart"/>
+      <w:r>
+        <w:t>jekyll</w:t>
+      </w:r>
+      <w:proofErr w:type="spellEnd"/>
+      <w:r>
+        <w:t xml:space="preserve"> serve</w:t>
       </w:r>
       <w:r>
         <w:t xml:space="preserve"> --future</w:t>
@@ -131,7 +144,7 @@
     </w:p>
     <w:p>
       <w:pPr>
-        <w:pStyle w:val="a4"/>
+        <w:pStyle w:val="ListParagraph"/>
         <w:numPr>
           <w:ilvl w:val="1"/>
           <w:numId w:val="1"/>
@@ -139,12 +152,20 @@
         <w:ind w:leftChars="0"/>
       </w:pPr>
       <w:r>
-        <w:t>Open a web browser and go to 127.0.0.1:4000 or localhost:4000</w:t>
-      </w:r>
-    </w:p>
-    <w:p>
-      <w:pPr>
-        <w:pStyle w:val="a4"/>
+        <w:t xml:space="preserve">Open a web browser and go to </w:t>
+      </w:r>
+      <w:bookmarkStart w:id="0" w:name="OLE_LINK1"/>
+      <w:r>
+        <w:t xml:space="preserve">127.0.0.1:4000 </w:t>
+      </w:r>
+      <w:bookmarkEnd w:id="0"/>
+      <w:r>
+        <w:t>or localhost:4000</w:t>
+      </w:r>
+    </w:p>
+    <w:p>
+      <w:pPr>
+        <w:pStyle w:val="ListParagraph"/>
         <w:numPr>
           <w:ilvl w:val="0"/>
           <w:numId w:val="1"/>
@@ -157,7 +178,7 @@
     </w:p>
     <w:p>
       <w:pPr>
-        <w:pStyle w:val="a4"/>
+        <w:pStyle w:val="ListParagraph"/>
         <w:numPr>
           <w:ilvl w:val="1"/>
           <w:numId w:val="1"/>
@@ -179,7 +200,7 @@
     </w:p>
     <w:p>
       <w:pPr>
-        <w:pStyle w:val="a4"/>
+        <w:pStyle w:val="ListParagraph"/>
         <w:numPr>
           <w:ilvl w:val="1"/>
           <w:numId w:val="1"/>
@@ -214,7 +235,7 @@
     </w:p>
     <w:p>
       <w:pPr>
-        <w:pStyle w:val="a4"/>
+        <w:pStyle w:val="ListParagraph"/>
         <w:numPr>
           <w:ilvl w:val="0"/>
           <w:numId w:val="3"/>
@@ -233,7 +254,7 @@
     </w:p>
     <w:p>
       <w:pPr>
-        <w:pStyle w:val="a4"/>
+        <w:pStyle w:val="ListParagraph"/>
         <w:numPr>
           <w:ilvl w:val="0"/>
           <w:numId w:val="3"/>
@@ -246,7 +267,7 @@
     </w:p>
     <w:p>
       <w:pPr>
-        <w:pStyle w:val="a4"/>
+        <w:pStyle w:val="ListParagraph"/>
         <w:numPr>
           <w:ilvl w:val="1"/>
           <w:numId w:val="3"/>
@@ -262,7 +283,7 @@
     </w:p>
     <w:p>
       <w:pPr>
-        <w:pStyle w:val="a4"/>
+        <w:pStyle w:val="ListParagraph"/>
         <w:numPr>
           <w:ilvl w:val="2"/>
           <w:numId w:val="3"/>
@@ -275,7 +296,7 @@
     </w:p>
     <w:p>
       <w:pPr>
-        <w:pStyle w:val="a4"/>
+        <w:pStyle w:val="ListParagraph"/>
         <w:numPr>
           <w:ilvl w:val="2"/>
           <w:numId w:val="3"/>
@@ -288,7 +309,7 @@
     </w:p>
     <w:p>
       <w:pPr>
-        <w:pStyle w:val="a4"/>
+        <w:pStyle w:val="ListParagraph"/>
         <w:numPr>
           <w:ilvl w:val="0"/>
           <w:numId w:val="3"/>
@@ -301,7 +322,7 @@
     </w:p>
     <w:p>
       <w:pPr>
-        <w:pStyle w:val="a4"/>
+        <w:pStyle w:val="ListParagraph"/>
         <w:numPr>
           <w:ilvl w:val="1"/>
           <w:numId w:val="3"/>
@@ -314,7 +335,7 @@
     </w:p>
     <w:p>
       <w:pPr>
-        <w:pStyle w:val="a4"/>
+        <w:pStyle w:val="ListParagraph"/>
         <w:numPr>
           <w:ilvl w:val="0"/>
           <w:numId w:val="3"/>
@@ -327,7 +348,7 @@
     </w:p>
     <w:p>
       <w:pPr>
-        <w:pStyle w:val="a4"/>
+        <w:pStyle w:val="ListParagraph"/>
         <w:numPr>
           <w:ilvl w:val="1"/>
           <w:numId w:val="3"/>
@@ -336,12 +357,20 @@
       </w:pPr>
       <w:r>
         <w:lastRenderedPageBreak/>
-        <w:t>bundler exec jekyll build</w:t>
-      </w:r>
-    </w:p>
-    <w:p>
-      <w:pPr>
-        <w:pStyle w:val="a4"/>
+        <w:t xml:space="preserve">bundler exec </w:t>
+      </w:r>
+      <w:proofErr w:type="spellStart"/>
+      <w:r>
+        <w:t>jekyll</w:t>
+      </w:r>
+      <w:proofErr w:type="spellEnd"/>
+      <w:r>
+        <w:t xml:space="preserve"> build</w:t>
+      </w:r>
+    </w:p>
+    <w:p>
+      <w:pPr>
+        <w:pStyle w:val="ListParagraph"/>
         <w:numPr>
           <w:ilvl w:val="0"/>
           <w:numId w:val="3"/>
@@ -406,7 +435,7 @@
     </w:p>
     <w:p>
       <w:pPr>
-        <w:pStyle w:val="a4"/>
+        <w:pStyle w:val="ListParagraph"/>
         <w:numPr>
           <w:ilvl w:val="0"/>
           <w:numId w:val="4"/>
@@ -422,7 +451,7 @@
     </w:p>
     <w:p>
       <w:pPr>
-        <w:pStyle w:val="a4"/>
+        <w:pStyle w:val="ListParagraph"/>
         <w:numPr>
           <w:ilvl w:val="0"/>
           <w:numId w:val="4"/>
@@ -481,14 +510,27 @@
       </w:r>
     </w:p>
     <w:p>
-      <w:r>
-        <w:t>Also Jekyll allows users to use markdown language for posting.</w:t>
+      <w:proofErr w:type="gramStart"/>
+      <w:r>
+        <w:t>Also</w:t>
+      </w:r>
+      <w:proofErr w:type="gramEnd"/>
+      <w:r>
+        <w:t xml:space="preserve"> Jekyll allows users to use markdown language for posting.</w:t>
       </w:r>
     </w:p>
     <w:p/>
     <w:p>
       <w:r>
-        <w:t>This is test post for a publication</w:t>
+        <w:t xml:space="preserve">This is </w:t>
+      </w:r>
+      <w:proofErr w:type="gramStart"/>
+      <w:r>
+        <w:t>test</w:t>
+      </w:r>
+      <w:proofErr w:type="gramEnd"/>
+      <w:r>
+        <w:t xml:space="preserve"> post for a publication</w:t>
       </w:r>
     </w:p>
     <w:p>
@@ -518,7 +560,7 @@
       <w:hyperlink r:id="rId9" w:history="1">
         <w:r>
           <w:rPr>
-            <w:rStyle w:val="a3"/>
+            <w:rStyle w:val="Hyperlink"/>
           </w:rPr>
           <w:t>http://google.com</w:t>
         </w:r>
@@ -550,116 +592,172 @@
     <w:p/>
     <w:p>
       <w:r>
-        <w:t>[[PDF]]</w:t>
-      </w:r>
-      <w:r>
-        <w:t>({http://google.com})</w:t>
-      </w:r>
-    </w:p>
-    <w:p>
-      <w:r>
-        <w:t>[[Slide]](</w:t>
+        <w:t>[[PDF</w:t>
+      </w:r>
+      <w:proofErr w:type="gramStart"/>
+      <w:r>
+        <w:t>]]</w:t>
+      </w:r>
+      <w:r>
+        <w:t>(</w:t>
+      </w:r>
+      <w:proofErr w:type="gramEnd"/>
+      <w:r>
+        <w:t>{http://google.com})</w:t>
+      </w:r>
+    </w:p>
+    <w:p>
+      <w:r>
+        <w:t>[[Slide</w:t>
+      </w:r>
+      <w:proofErr w:type="gramStart"/>
+      <w:r>
+        <w:t>]](</w:t>
+      </w:r>
+      <w:proofErr w:type="gramEnd"/>
+      <w:r>
+        <w:fldChar w:fldCharType="begin"/>
+      </w:r>
+      <w:r>
+        <w:instrText>HYPERLINK "http://ranger.uta.edu/~mingli/publications/Acoussist.pdf"</w:instrText>
+      </w:r>
+      <w:r>
+        <w:fldChar w:fldCharType="separate"/>
+      </w:r>
+      <w:r>
+        <w:rPr>
+          <w:rStyle w:val="Hyperlink"/>
+        </w:rPr>
+        <w:t>http://ranger.uta.edu/~mingli/publications/Acoussist.pdf</w:t>
+      </w:r>
+      <w:r>
+        <w:fldChar w:fldCharType="end"/>
+      </w:r>
+      <w:r>
+        <w:t>)</w:t>
+      </w:r>
+    </w:p>
+    <w:p/>
+    <w:p>
+      <w:r>
+        <w:lastRenderedPageBreak/>
+        <w:t xml:space="preserve">A post must </w:t>
+      </w:r>
+      <w:proofErr w:type="gramStart"/>
+      <w:r>
+        <w:t>has</w:t>
+      </w:r>
+      <w:proofErr w:type="gramEnd"/>
+      <w:r>
+        <w:t xml:space="preserve"> title, and categories</w:t>
+      </w:r>
+    </w:p>
+    <w:p>
+      <w:r>
+        <w:t xml:space="preserve">If a post is for publication, categories should have </w:t>
+      </w:r>
+      <w:r>
+        <w:t xml:space="preserve">“- </w:t>
+      </w:r>
+      <w:r>
+        <w:t>research</w:t>
+      </w:r>
+      <w:r>
+        <w:t>”. for news, “- news” should be there.</w:t>
+      </w:r>
+    </w:p>
+    <w:p>
+      <w:proofErr w:type="gramStart"/>
+      <w:r>
+        <w:t>Also</w:t>
+      </w:r>
+      <w:proofErr w:type="gramEnd"/>
+      <w:r>
+        <w:t xml:space="preserve"> you can add PDF and Slide file link like test post. Please add PDF and Slide in </w:t>
+      </w:r>
+      <w:r>
+        <w:t>post head section.</w:t>
+      </w:r>
+      <w:r>
+        <w:rPr>
+          <w:rFonts w:hint="eastAsia"/>
+        </w:rPr>
+        <w:t xml:space="preserve"> </w:t>
+      </w:r>
+      <w:r>
+        <w:t>This information will update recent publication sections PDF and Slide.</w:t>
+      </w:r>
+    </w:p>
+    <w:p>
+      <w:proofErr w:type="gramStart"/>
+      <w:r>
+        <w:t>Also</w:t>
+      </w:r>
+      <w:proofErr w:type="gramEnd"/>
+      <w:r>
+        <w:t xml:space="preserve"> you can add PDF and Slide link in the post content.</w:t>
+      </w:r>
+    </w:p>
+    <w:p>
+      <w:r>
+        <w:t>In this time, you should use hyperlink by following markdown grammar.</w:t>
+      </w:r>
+    </w:p>
+    <w:p>
+      <w:r>
+        <w:t xml:space="preserve">The grammar is this </w:t>
+      </w:r>
+    </w:p>
+    <w:p>
+      <w:r>
+        <w:rPr>
+          <w:rFonts w:hint="eastAsia"/>
+        </w:rPr>
+        <w:t>[</w:t>
+      </w:r>
+      <w:r>
+        <w:t xml:space="preserve">link </w:t>
+      </w:r>
+      <w:proofErr w:type="gramStart"/>
+      <w:r>
+        <w:t>text](</w:t>
+      </w:r>
+      <w:proofErr w:type="gramEnd"/>
+      <w:r>
+        <w:fldChar w:fldCharType="begin"/>
+      </w:r>
+      <w:r>
+        <w:instrText>HYPERLINK "http://link-url.com"</w:instrText>
+      </w:r>
+      <w:r>
+        <w:fldChar w:fldCharType="separate"/>
+      </w:r>
+      <w:r>
+        <w:rPr>
+          <w:rStyle w:val="Hyperlink"/>
+        </w:rPr>
+        <w:t>http://link-url.com</w:t>
+      </w:r>
+      <w:r>
+        <w:fldChar w:fldCharType="end"/>
+      </w:r>
+      <w:r>
+        <w:t>)</w:t>
+      </w:r>
+    </w:p>
+    <w:p>
+      <w:r>
+        <w:t>Markdown code lines will be replaced html code by Jekyll.</w:t>
+      </w:r>
+    </w:p>
+    <w:p>
+      <w:r>
+        <w:t xml:space="preserve">For other markdown information, please refer this </w:t>
       </w:r>
       <w:hyperlink r:id="rId10" w:history="1">
         <w:r>
           <w:rPr>
-            <w:rStyle w:val="a3"/>
-          </w:rPr>
-          <w:t>http://ranger.uta.edu/~mingli/publications/Acoussist.pdf</w:t>
-        </w:r>
-      </w:hyperlink>
-      <w:r>
-        <w:t>)</w:t>
-      </w:r>
-    </w:p>
-    <w:p/>
-    <w:p>
-      <w:r>
-        <w:lastRenderedPageBreak/>
-        <w:t>A post must has title, and categories</w:t>
-      </w:r>
-    </w:p>
-    <w:p>
-      <w:r>
-        <w:t xml:space="preserve">If a post is for publication, categories should have </w:t>
-      </w:r>
-      <w:r>
-        <w:t xml:space="preserve">“- </w:t>
-      </w:r>
-      <w:r>
-        <w:t>research</w:t>
-      </w:r>
-      <w:r>
-        <w:t>”. for news, “- news” should be there.</w:t>
-      </w:r>
-    </w:p>
-    <w:p>
-      <w:r>
-        <w:t xml:space="preserve">Also you can add PDF and Slide file link like test post. Please add PDF and Slide in </w:t>
-      </w:r>
-      <w:r>
-        <w:t>post head section.</w:t>
-      </w:r>
-      <w:r>
-        <w:rPr>
-          <w:rFonts w:hint="eastAsia"/>
-        </w:rPr>
-        <w:t xml:space="preserve"> </w:t>
-      </w:r>
-      <w:r>
-        <w:t>This information will update recent publication sections PDF and Slide.</w:t>
-      </w:r>
-    </w:p>
-    <w:p>
-      <w:r>
-        <w:t>Also you can add PDF and Slide link in the post content.</w:t>
-      </w:r>
-    </w:p>
-    <w:p>
-      <w:r>
-        <w:t>In this time, you should use hyperlink by following markdown grammar.</w:t>
-      </w:r>
-    </w:p>
-    <w:p>
-      <w:r>
-        <w:t xml:space="preserve">The grammar is this </w:t>
-      </w:r>
-    </w:p>
-    <w:p>
-      <w:r>
-        <w:rPr>
-          <w:rFonts w:hint="eastAsia"/>
-        </w:rPr>
-        <w:t>[</w:t>
-      </w:r>
-      <w:r>
-        <w:t>link text](</w:t>
-      </w:r>
-      <w:hyperlink r:id="rId11" w:history="1">
-        <w:r>
-          <w:rPr>
-            <w:rStyle w:val="a3"/>
-          </w:rPr>
-          <w:t>http://link-url.com</w:t>
-        </w:r>
-      </w:hyperlink>
-      <w:r>
-        <w:t>)</w:t>
-      </w:r>
-    </w:p>
-    <w:p>
-      <w:r>
-        <w:t>Markdown code lines will be replaced html code by Jekyll.</w:t>
-      </w:r>
-    </w:p>
-    <w:p>
-      <w:r>
-        <w:t xml:space="preserve">For other markdown information, please refer this </w:t>
-      </w:r>
-      <w:hyperlink r:id="rId12" w:history="1">
-        <w:r>
-          <w:rPr>
-            <w:rStyle w:val="a3"/>
+            <w:rStyle w:val="Hyperlink"/>
           </w:rPr>
           <w:t>Jekyll Markdown Reference | Markdown Guide</w:t>
         </w:r>
@@ -674,7 +772,15 @@
     <w:p/>
     <w:p>
       <w:r>
-        <w:t>After making your new file, Do not forget re-build, re-upload the website file which is updated.</w:t>
+        <w:t xml:space="preserve">After making your new file, </w:t>
+      </w:r>
+      <w:proofErr w:type="gramStart"/>
+      <w:r>
+        <w:t>Do</w:t>
+      </w:r>
+      <w:proofErr w:type="gramEnd"/>
+      <w:r>
+        <w:t xml:space="preserve"> not forget re-build, re-upload the website file which is updated.</w:t>
       </w:r>
     </w:p>
     <w:p>
@@ -711,13 +817,26 @@
     </w:p>
     <w:p>
       <w:r>
-        <w:t xml:space="preserve">    Hi Youngtak, in the website, how should I update any information under "people"-page</w:t>
-      </w:r>
-    </w:p>
-    <w:p>
-      <w:r>
-        <w:t>​[10:10 PM] Cho, Youngtak</w:t>
-      </w:r>
+        <w:t xml:space="preserve">    Hi Youngtak, </w:t>
+      </w:r>
+      <w:proofErr w:type="gramStart"/>
+      <w:r>
+        <w:t>in</w:t>
+      </w:r>
+      <w:proofErr w:type="gramEnd"/>
+      <w:r>
+        <w:t xml:space="preserve"> the website, how should I update any information under "people"-page</w:t>
+      </w:r>
+    </w:p>
+    <w:p>
+      <w:r>
+        <w:t xml:space="preserve">​[10:10 PM] Cho, </w:t>
+      </w:r>
+      <w:proofErr w:type="spellStart"/>
+      <w:r>
+        <w:t>Youngtak</w:t>
+      </w:r>
+      <w:proofErr w:type="spellEnd"/>
     </w:p>
     <w:p>
       <w:r>
@@ -773,7 +892,11 @@
         <w:t xml:space="preserve">Go to </w:t>
       </w:r>
       <w:r>
-        <w:t>_posts</w:t>
+        <w:t>_</w:t>
+      </w:r>
+      <w:proofErr w:type="spellStart"/>
+      <w:r>
+        <w:t>posts</w:t>
       </w:r>
       <w:r>
         <w:rPr>
@@ -784,6 +907,7 @@
       <w:r>
         <w:t>research</w:t>
       </w:r>
+      <w:proofErr w:type="spellEnd"/>
     </w:p>
     <w:p>
       <w:pPr>
@@ -823,7 +947,7 @@
 </file>
 
 <file path=word/numbering.xml><?xml version="1.0" encoding="utf-8"?>
-<w:numbering xmlns:wpc="http://schemas.microsoft.com/office/word/2010/wordprocessingCanvas" xmlns:cx="http://schemas.microsoft.com/office/drawing/2014/chartex" xmlns:cx1="http://schemas.microsoft.com/office/drawing/2015/9/8/chartex" xmlns:cx2="http://schemas.microsoft.com/office/drawing/2015/10/21/chartex" xmlns:cx3="http://schemas.microsoft.com/office/drawing/2016/5/9/chartex" xmlns:cx4="http://schemas.microsoft.com/office/drawing/2016/5/10/chartex" xmlns:cx5="http://schemas.microsoft.com/office/drawing/2016/5/11/chartex" xmlns:cx6="http://schemas.microsoft.com/office/drawing/2016/5/12/chartex" xmlns:cx7="http://schemas.microsoft.com/office/drawing/2016/5/13/chartex" xmlns:cx8="http://schemas.microsoft.com/office/drawing/2016/5/14/chartex" xmlns:mc="http://schemas.openxmlformats.org/markup-compatibility/2006" xmlns:aink="http://schemas.microsoft.com/office/drawing/2016/ink" xmlns:am3d="http://schemas.microsoft.com/office/drawing/2017/model3d" xmlns:o="urn:schemas-microsoft-com:office:office" xmlns:oel="http://schemas.microsoft.com/office/2019/extlst" xmlns:r="http://schemas.openxmlformats.org/officeDocument/2006/relationships" xmlns:m="http://schemas.openxmlformats.org/officeDocument/2006/math" xmlns:v="urn:schemas-microsoft-com:vml" xmlns:wp14="http://schemas.microsoft.com/office/word/2010/wordprocessingDrawing" xmlns:wp="http://schemas.openxmlformats.org/drawingml/2006/wordprocessingDrawing" xmlns:w10="urn:schemas-microsoft-com:office:word" xmlns:w="http://schemas.openxmlformats.org/wordprocessingml/2006/main" xmlns:w14="http://schemas.microsoft.com/office/word/2010/wordml" xmlns:w15="http://schemas.microsoft.com/office/word/2012/wordml" xmlns:w16cex="http://schemas.microsoft.com/office/word/2018/wordml/cex" xmlns:w16cid="http://schemas.microsoft.com/office/word/2016/wordml/cid" xmlns:w16="http://schemas.microsoft.com/office/word/2018/wordml" xmlns:w16sdtdh="http://schemas.microsoft.com/office/word/2020/wordml/sdtdatahash" xmlns:w16se="http://schemas.microsoft.com/office/word/2015/wordml/symex" xmlns:wpg="http://schemas.microsoft.com/office/word/2010/wordprocessingGroup" xmlns:wpi="http://schemas.microsoft.com/office/word/2010/wordprocessingInk" xmlns:wne="http://schemas.microsoft.com/office/word/2006/wordml" xmlns:wps="http://schemas.microsoft.com/office/word/2010/wordprocessingShape" mc:Ignorable="w14 w15 w16se w16cid w16 w16cex w16sdtdh wp14">
+<w:numbering xmlns:wpc="http://schemas.microsoft.com/office/word/2010/wordprocessingCanvas" xmlns:cx="http://schemas.microsoft.com/office/drawing/2014/chartex" xmlns:cx1="http://schemas.microsoft.com/office/drawing/2015/9/8/chartex" xmlns:cx2="http://schemas.microsoft.com/office/drawing/2015/10/21/chartex" xmlns:cx3="http://schemas.microsoft.com/office/drawing/2016/5/9/chartex" xmlns:cx4="http://schemas.microsoft.com/office/drawing/2016/5/10/chartex" xmlns:cx5="http://schemas.microsoft.com/office/drawing/2016/5/11/chartex" xmlns:cx6="http://schemas.microsoft.com/office/drawing/2016/5/12/chartex" xmlns:cx7="http://schemas.microsoft.com/office/drawing/2016/5/13/chartex" xmlns:cx8="http://schemas.microsoft.com/office/drawing/2016/5/14/chartex" xmlns:mc="http://schemas.openxmlformats.org/markup-compatibility/2006" xmlns:aink="http://schemas.microsoft.com/office/drawing/2016/ink" xmlns:am3d="http://schemas.microsoft.com/office/drawing/2017/model3d" xmlns:o="urn:schemas-microsoft-com:office:office" xmlns:oel="http://schemas.microsoft.com/office/2019/extlst" xmlns:r="http://schemas.openxmlformats.org/officeDocument/2006/relationships" xmlns:m="http://schemas.openxmlformats.org/officeDocument/2006/math" xmlns:v="urn:schemas-microsoft-com:vml" xmlns:wp14="http://schemas.microsoft.com/office/word/2010/wordprocessingDrawing" xmlns:wp="http://schemas.openxmlformats.org/drawingml/2006/wordprocessingDrawing" xmlns:w10="urn:schemas-microsoft-com:office:word" xmlns:w="http://schemas.openxmlformats.org/wordprocessingml/2006/main" xmlns:w14="http://schemas.microsoft.com/office/word/2010/wordml" xmlns:w15="http://schemas.microsoft.com/office/word/2012/wordml" xmlns:w16cex="http://schemas.microsoft.com/office/word/2018/wordml/cex" xmlns:w16cid="http://schemas.microsoft.com/office/word/2016/wordml/cid" xmlns:w16="http://schemas.microsoft.com/office/word/2018/wordml" xmlns:w16du="http://schemas.microsoft.com/office/word/2023/wordml/word16du" xmlns:w16sdtdh="http://schemas.microsoft.com/office/word/2020/wordml/sdtdatahash" xmlns:w16sdtfl="http://schemas.microsoft.com/office/word/2024/wordml/sdtformatlock" xmlns:w16se="http://schemas.microsoft.com/office/word/2015/wordml/symex" xmlns:wpg="http://schemas.microsoft.com/office/word/2010/wordprocessingGroup" xmlns:wpi="http://schemas.microsoft.com/office/word/2010/wordprocessingInk" xmlns:wne="http://schemas.microsoft.com/office/word/2006/wordml" xmlns:wps="http://schemas.microsoft.com/office/word/2010/wordprocessingShape" mc:Ignorable="w14 w15 w16se w16cid w16 w16cex w16sdtdh w16sdtfl w16du wp14">
   <w:abstractNum w:abstractNumId="0" w15:restartNumberingAfterBreak="0">
     <w:nsid w:val="32360CD8"/>
     <w:multiLevelType w:val="hybridMultilevel"/>
@@ -1196,7 +1320,7 @@
 </file>
 
 <file path=word/styles.xml><?xml version="1.0" encoding="utf-8"?>
-<w:styles xmlns:mc="http://schemas.openxmlformats.org/markup-compatibility/2006" xmlns:r="http://schemas.openxmlformats.org/officeDocument/2006/relationships" xmlns:w="http://schemas.openxmlformats.org/wordprocessingml/2006/main" xmlns:w14="http://schemas.microsoft.com/office/word/2010/wordml" xmlns:w15="http://schemas.microsoft.com/office/word/2012/wordml" xmlns:w16cex="http://schemas.microsoft.com/office/word/2018/wordml/cex" xmlns:w16cid="http://schemas.microsoft.com/office/word/2016/wordml/cid" xmlns:w16="http://schemas.microsoft.com/office/word/2018/wordml" xmlns:w16sdtdh="http://schemas.microsoft.com/office/word/2020/wordml/sdtdatahash" xmlns:w16se="http://schemas.microsoft.com/office/word/2015/wordml/symex" mc:Ignorable="w14 w15 w16se w16cid w16 w16cex w16sdtdh">
+<w:styles xmlns:mc="http://schemas.openxmlformats.org/markup-compatibility/2006" xmlns:r="http://schemas.openxmlformats.org/officeDocument/2006/relationships" xmlns:w="http://schemas.openxmlformats.org/wordprocessingml/2006/main" xmlns:w14="http://schemas.microsoft.com/office/word/2010/wordml" xmlns:w15="http://schemas.microsoft.com/office/word/2012/wordml" xmlns:w16cex="http://schemas.microsoft.com/office/word/2018/wordml/cex" xmlns:w16cid="http://schemas.microsoft.com/office/word/2016/wordml/cid" xmlns:w16="http://schemas.microsoft.com/office/word/2018/wordml" xmlns:w16du="http://schemas.microsoft.com/office/word/2023/wordml/word16du" xmlns:w16sdtdh="http://schemas.microsoft.com/office/word/2020/wordml/sdtdatahash" xmlns:w16sdtfl="http://schemas.microsoft.com/office/word/2024/wordml/sdtformatlock" xmlns:w16se="http://schemas.microsoft.com/office/word/2015/wordml/symex" mc:Ignorable="w14 w15 w16se w16cid w16 w16cex w16sdtdh w16sdtfl w16du">
   <w:docDefaults>
     <w:rPrDefault>
       <w:rPr>
@@ -1591,7 +1715,7 @@
     <w:lsdException w:name="Unresolved Mention" w:semiHidden="1" w:unhideWhenUsed="1"/>
     <w:lsdException w:name="Smart Link" w:semiHidden="1" w:unhideWhenUsed="1"/>
   </w:latentStyles>
-  <w:style w:type="paragraph" w:default="1" w:styleId="a">
+  <w:style w:type="paragraph" w:default="1" w:styleId="Normal">
     <w:name w:val="Normal"/>
     <w:qFormat/>
     <w:pPr>
@@ -1601,13 +1725,13 @@
       <w:autoSpaceDN w:val="0"/>
     </w:pPr>
   </w:style>
-  <w:style w:type="character" w:default="1" w:styleId="a0">
+  <w:style w:type="character" w:default="1" w:styleId="DefaultParagraphFont">
     <w:name w:val="Default Paragraph Font"/>
     <w:uiPriority w:val="1"/>
     <w:semiHidden/>
     <w:unhideWhenUsed/>
   </w:style>
-  <w:style w:type="table" w:default="1" w:styleId="a1">
+  <w:style w:type="table" w:default="1" w:styleId="TableNormal">
     <w:name w:val="Normal Table"/>
     <w:uiPriority w:val="99"/>
     <w:semiHidden/>
@@ -1622,15 +1746,15 @@
       </w:tblCellMar>
     </w:tblPr>
   </w:style>
-  <w:style w:type="numbering" w:default="1" w:styleId="a2">
+  <w:style w:type="numbering" w:default="1" w:styleId="NoList">
     <w:name w:val="No List"/>
     <w:uiPriority w:val="99"/>
     <w:semiHidden/>
     <w:unhideWhenUsed/>
   </w:style>
-  <w:style w:type="character" w:styleId="a3">
+  <w:style w:type="character" w:styleId="Hyperlink">
     <w:name w:val="Hyperlink"/>
-    <w:basedOn w:val="a0"/>
+    <w:basedOn w:val="DefaultParagraphFont"/>
     <w:uiPriority w:val="99"/>
     <w:unhideWhenUsed/>
     <w:rsid w:val="007205C3"/>
@@ -1639,9 +1763,9 @@
       <w:u w:val="single"/>
     </w:rPr>
   </w:style>
-  <w:style w:type="paragraph" w:styleId="a4">
+  <w:style w:type="paragraph" w:styleId="ListParagraph">
     <w:name w:val="List Paragraph"/>
-    <w:basedOn w:val="a"/>
+    <w:basedOn w:val="Normal"/>
     <w:uiPriority w:val="34"/>
     <w:qFormat/>
     <w:rsid w:val="00643F39"/>
@@ -1649,9 +1773,9 @@
       <w:ind w:leftChars="400" w:left="800"/>
     </w:pPr>
   </w:style>
-  <w:style w:type="character" w:styleId="a5">
+  <w:style w:type="character" w:styleId="UnresolvedMention">
     <w:name w:val="Unresolved Mention"/>
-    <w:basedOn w:val="a0"/>
+    <w:basedOn w:val="DefaultParagraphFont"/>
     <w:uiPriority w:val="99"/>
     <w:semiHidden/>
     <w:unhideWhenUsed/>
@@ -1960,12 +2084,9 @@
 </file>
 
 <file path=customXml/item1.xml><?xml version="1.0" encoding="utf-8"?>
-<?mso-contentType ?>
-<FormTemplates xmlns="http://schemas.microsoft.com/sharepoint/v3/contenttype/forms">
-  <Display>DocumentLibraryForm</Display>
-  <Edit>DocumentLibraryForm</Edit>
-  <New>DocumentLibraryForm</New>
-</FormTemplates>
+<p:properties xmlns:p="http://schemas.microsoft.com/office/2006/metadata/properties" xmlns:xsi="http://www.w3.org/2001/XMLSchema-instance" xmlns:pc="http://schemas.microsoft.com/office/infopath/2007/PartnerControls">
+  <documentManagement/>
+</p:properties>
 </file>
 
 <file path=customXml/item2.xml><?xml version="1.0" encoding="utf-8"?>
@@ -2141,15 +2262,19 @@
 </file>
 
 <file path=customXml/item3.xml><?xml version="1.0" encoding="utf-8"?>
-<p:properties xmlns:p="http://schemas.microsoft.com/office/2006/metadata/properties" xmlns:xsi="http://www.w3.org/2001/XMLSchema-instance" xmlns:pc="http://schemas.microsoft.com/office/infopath/2007/PartnerControls">
-  <documentManagement/>
-</p:properties>
+<?mso-contentType ?>
+<FormTemplates xmlns="http://schemas.microsoft.com/sharepoint/v3/contenttype/forms">
+  <Display>DocumentLibraryForm</Display>
+  <Edit>DocumentLibraryForm</Edit>
+  <New>DocumentLibraryForm</New>
+</FormTemplates>
 </file>
 
 <file path=customXml/itemProps1.xml><?xml version="1.0" encoding="utf-8"?>
-<ds:datastoreItem xmlns:ds="http://schemas.openxmlformats.org/officeDocument/2006/customXml" ds:itemID="{B7FD3C3D-FDE2-4BD1-9BA6-E1995C8B7018}">
+<ds:datastoreItem xmlns:ds="http://schemas.openxmlformats.org/officeDocument/2006/customXml" ds:itemID="{C4FC995F-CA48-4141-A1C8-581FFC340EBF}">
   <ds:schemaRefs>
-    <ds:schemaRef ds:uri="http://schemas.microsoft.com/sharepoint/v3/contenttype/forms"/>
+    <ds:schemaRef ds:uri="http://schemas.microsoft.com/office/2006/metadata/properties"/>
+    <ds:schemaRef ds:uri="http://schemas.microsoft.com/office/infopath/2007/PartnerControls"/>
   </ds:schemaRefs>
 </ds:datastoreItem>
 </file>
@@ -2173,10 +2298,9 @@
 </file>
 
 <file path=customXml/itemProps3.xml><?xml version="1.0" encoding="utf-8"?>
-<ds:datastoreItem xmlns:ds="http://schemas.openxmlformats.org/officeDocument/2006/customXml" ds:itemID="{C4FC995F-CA48-4141-A1C8-581FFC340EBF}">
+<ds:datastoreItem xmlns:ds="http://schemas.openxmlformats.org/officeDocument/2006/customXml" ds:itemID="{B7FD3C3D-FDE2-4BD1-9BA6-E1995C8B7018}">
   <ds:schemaRefs>
-    <ds:schemaRef ds:uri="http://schemas.microsoft.com/office/2006/metadata/properties"/>
-    <ds:schemaRef ds:uri="http://schemas.microsoft.com/office/infopath/2007/PartnerControls"/>
+    <ds:schemaRef ds:uri="http://schemas.microsoft.com/sharepoint/v3/contenttype/forms"/>
   </ds:schemaRefs>
 </ds:datastoreItem>
 </file>
</xml_diff>